<commit_message>
Made changes to AI declaration form
</commit_message>
<xml_diff>
--- a/Aduama_Vladimir_Lab_1/AI_Use_Declaration_Form - Lab 1.docx
+++ b/Aduama_Vladimir_Lab_1/AI_Use_Declaration_Form - Lab 1.docx
@@ -157,17 +157,7 @@
           <w:b/>
           <w:bCs/>
         </w:rPr>
-        <w:t>Date Submit</w:t>
-      </w:r>
-      <w:bookmarkStart w:id="0" w:name="_GoBack"/>
-      <w:bookmarkEnd w:id="0"/>
-      <w:r>
-        <w:rPr>
-          <w:rFonts w:ascii="Times New Roman" w:hAnsi="Times New Roman" w:cs="Times New Roman"/>
-          <w:b/>
-          <w:bCs/>
-        </w:rPr>
-        <w:t>ted:</w:t>
+        <w:t>Date Submitted:</w:t>
       </w:r>
       <w:r>
         <w:rPr>
@@ -1256,6 +1246,128 @@
           </w:p>
         </w:tc>
       </w:tr>
+      <w:tr>
+        <w:tc>
+          <w:tcPr>
+            <w:tcW w:w="1870" w:type="dxa"/>
+          </w:tcPr>
+          <w:p>
+            <w:pPr>
+              <w:rPr>
+                <w:rFonts w:ascii="Times New Roman" w:hAnsi="Times New Roman" w:cs="Times New Roman"/>
+              </w:rPr>
+            </w:pPr>
+            <w:r>
+              <w:rPr>
+                <w:rFonts w:ascii="Times New Roman" w:hAnsi="Times New Roman" w:cs="Times New Roman"/>
+              </w:rPr>
+              <w:t>Claude</w:t>
+            </w:r>
+          </w:p>
+        </w:tc>
+        <w:tc>
+          <w:tcPr>
+            <w:tcW w:w="1870" w:type="dxa"/>
+          </w:tcPr>
+          <w:p>
+            <w:pPr>
+              <w:rPr>
+                <w:rFonts w:ascii="Times New Roman" w:hAnsi="Times New Roman" w:cs="Times New Roman"/>
+              </w:rPr>
+            </w:pPr>
+            <w:r>
+              <w:rPr>
+                <w:rFonts w:ascii="Times New Roman" w:hAnsi="Times New Roman" w:cs="Times New Roman"/>
+              </w:rPr>
+              <w:t xml:space="preserve">Generation of AI declaration form based on </w:t>
+            </w:r>
+            <w:proofErr w:type="spellStart"/>
+            <w:r>
+              <w:rPr>
+                <w:rFonts w:ascii="Times New Roman" w:hAnsi="Times New Roman" w:cs="Times New Roman"/>
+              </w:rPr>
+              <w:t>gemini</w:t>
+            </w:r>
+            <w:proofErr w:type="spellEnd"/>
+            <w:r>
+              <w:rPr>
+                <w:rFonts w:ascii="Times New Roman" w:hAnsi="Times New Roman" w:cs="Times New Roman"/>
+              </w:rPr>
+              <w:t xml:space="preserve"> chat history</w:t>
+            </w:r>
+          </w:p>
+        </w:tc>
+        <w:tc>
+          <w:tcPr>
+            <w:tcW w:w="1870" w:type="dxa"/>
+          </w:tcPr>
+          <w:p>
+            <w:pPr>
+              <w:rPr>
+                <w:rFonts w:ascii="Times New Roman" w:hAnsi="Times New Roman" w:cs="Times New Roman"/>
+              </w:rPr>
+            </w:pPr>
+            <w:r>
+              <w:rPr>
+                <w:rFonts w:ascii="Times New Roman" w:hAnsi="Times New Roman" w:cs="Times New Roman"/>
+              </w:rPr>
+              <w:t xml:space="preserve">Generate an </w:t>
+            </w:r>
+            <w:proofErr w:type="spellStart"/>
+            <w:r>
+              <w:rPr>
+                <w:rFonts w:ascii="Times New Roman" w:hAnsi="Times New Roman" w:cs="Times New Roman"/>
+              </w:rPr>
+              <w:t>ai</w:t>
+            </w:r>
+            <w:proofErr w:type="spellEnd"/>
+            <w:r>
+              <w:rPr>
+                <w:rFonts w:ascii="Times New Roman" w:hAnsi="Times New Roman" w:cs="Times New Roman"/>
+              </w:rPr>
+              <w:t xml:space="preserve"> declaration form based on this Gemini chat history and Declaration form</w:t>
+            </w:r>
+          </w:p>
+        </w:tc>
+        <w:tc>
+          <w:tcPr>
+            <w:tcW w:w="1870" w:type="dxa"/>
+          </w:tcPr>
+          <w:p>
+            <w:pPr>
+              <w:rPr>
+                <w:rFonts w:ascii="Times New Roman" w:hAnsi="Times New Roman" w:cs="Times New Roman"/>
+              </w:rPr>
+            </w:pPr>
+            <w:r>
+              <w:rPr>
+                <w:rFonts w:ascii="Times New Roman" w:hAnsi="Times New Roman" w:cs="Times New Roman"/>
+              </w:rPr>
+              <w:t>Declaration Form</w:t>
+            </w:r>
+          </w:p>
+        </w:tc>
+        <w:tc>
+          <w:tcPr>
+            <w:tcW w:w="1870" w:type="dxa"/>
+          </w:tcPr>
+          <w:p>
+            <w:pPr>
+              <w:rPr>
+                <w:rFonts w:ascii="Times New Roman" w:hAnsi="Times New Roman" w:cs="Times New Roman"/>
+              </w:rPr>
+            </w:pPr>
+            <w:r>
+              <w:rPr>
+                <w:rFonts w:ascii="Times New Roman" w:hAnsi="Times New Roman" w:cs="Times New Roman"/>
+              </w:rPr>
+              <w:t>I reviewed the output and made appropriate changes</w:t>
+            </w:r>
+            <w:bookmarkStart w:id="0" w:name="_GoBack"/>
+            <w:bookmarkEnd w:id="0"/>
+          </w:p>
+        </w:tc>
+      </w:tr>
     </w:tbl>
     <w:p>
       <w:pPr>
@@ -1896,7 +2008,6 @@
               <w:rPr>
                 <w:rFonts w:ascii="Times New Roman" w:hAnsi="Times New Roman" w:cs="Times New Roman"/>
               </w:rPr>
-              <w:lastRenderedPageBreak/>
               <w:t>Any use of AI tools has been clearly declared in this form.</w:t>
             </w:r>
           </w:p>

</xml_diff>